<commit_message>
arreglo cierre de liga faltante en google en web de autores
</commit_message>
<xml_diff>
--- a/FormatoRegistroDeCédula.docx
+++ b/FormatoRegistroDeCédula.docx
@@ -50,15 +50,7 @@
       </w:pPr>
       <w:r>
         <w:rPr/>
-        <w:t xml:space="preserve">1.- </w:t>
-      </w:r>
-      <w:r>
-        <w:rPr/>
-        <w:t xml:space="preserve">Nombre del Jardín al que pertenece la cédula: </w:t>
-      </w:r>
-      <w:r>
-        <w:rPr/>
-        <w:t>JebOax</w:t>
+        <w:t>1.- Nombre del Jardín al que pertenece la cédula: JebOax</w:t>
       </w:r>
     </w:p>
     <w:p>
@@ -95,11 +87,7 @@
       </w:pPr>
       <w:r>
         <w:rPr/>
-        <w:t xml:space="preserve">2.- </w:t>
-      </w:r>
-      <w:r>
-        <w:rPr/>
-        <w:t>Para cada uno de los autores*, indicar:</w:t>
+        <w:t>2.- Para cada uno de los autores*, indicar:</w:t>
       </w:r>
     </w:p>
     <w:tbl>
@@ -116,8 +104,8 @@
         </w:tblCellMar>
       </w:tblPr>
       <w:tblGrid>
-        <w:gridCol w:w="2159"/>
-        <w:gridCol w:w="2110"/>
+        <w:gridCol w:w="2158"/>
+        <w:gridCol w:w="2111"/>
         <w:gridCol w:w="2490"/>
         <w:gridCol w:w="2490"/>
       </w:tblGrid>
@@ -125,7 +113,7 @@
         <w:trPr/>
         <w:tc>
           <w:tcPr>
-            <w:tcW w:w="2159" w:type="dxa"/>
+            <w:tcW w:w="2158" w:type="dxa"/>
             <w:tcBorders>
               <w:top w:val="single" w:sz="4" w:space="0" w:color="000000"/>
               <w:left w:val="single" w:sz="4" w:space="0" w:color="000000"/>
@@ -152,7 +140,7 @@
         </w:tc>
         <w:tc>
           <w:tcPr>
-            <w:tcW w:w="2110" w:type="dxa"/>
+            <w:tcW w:w="2111" w:type="dxa"/>
             <w:tcBorders>
               <w:top w:val="single" w:sz="4" w:space="0" w:color="000000"/>
               <w:left w:val="single" w:sz="4" w:space="0" w:color="000000"/>
@@ -252,7 +240,7 @@
         <w:trPr/>
         <w:tc>
           <w:tcPr>
-            <w:tcW w:w="2159" w:type="dxa"/>
+            <w:tcW w:w="2158" w:type="dxa"/>
             <w:tcBorders>
               <w:left w:val="single" w:sz="4" w:space="0" w:color="000000"/>
               <w:bottom w:val="single" w:sz="4" w:space="0" w:color="000000"/>
@@ -296,7 +284,7 @@
         </w:tc>
         <w:tc>
           <w:tcPr>
-            <w:tcW w:w="2110" w:type="dxa"/>
+            <w:tcW w:w="2111" w:type="dxa"/>
             <w:tcBorders>
               <w:left w:val="single" w:sz="4" w:space="0" w:color="000000"/>
               <w:bottom w:val="single" w:sz="4" w:space="0" w:color="000000"/>
@@ -378,7 +366,7 @@
         <w:trPr/>
         <w:tc>
           <w:tcPr>
-            <w:tcW w:w="2159" w:type="dxa"/>
+            <w:tcW w:w="2158" w:type="dxa"/>
             <w:tcBorders>
               <w:left w:val="single" w:sz="4" w:space="0" w:color="000000"/>
               <w:bottom w:val="single" w:sz="4" w:space="0" w:color="000000"/>
@@ -423,7 +411,7 @@
         </w:tc>
         <w:tc>
           <w:tcPr>
-            <w:tcW w:w="2110" w:type="dxa"/>
+            <w:tcW w:w="2111" w:type="dxa"/>
             <w:tcBorders>
               <w:left w:val="single" w:sz="4" w:space="0" w:color="000000"/>
               <w:bottom w:val="single" w:sz="4" w:space="0" w:color="000000"/>
@@ -505,7 +493,7 @@
         <w:trPr/>
         <w:tc>
           <w:tcPr>
-            <w:tcW w:w="2159" w:type="dxa"/>
+            <w:tcW w:w="2158" w:type="dxa"/>
             <w:tcBorders>
               <w:left w:val="single" w:sz="4" w:space="0" w:color="000000"/>
               <w:bottom w:val="single" w:sz="4" w:space="0" w:color="000000"/>
@@ -532,7 +520,7 @@
         </w:tc>
         <w:tc>
           <w:tcPr>
-            <w:tcW w:w="2110" w:type="dxa"/>
+            <w:tcW w:w="2111" w:type="dxa"/>
             <w:tcBorders>
               <w:left w:val="single" w:sz="4" w:space="0" w:color="000000"/>
               <w:bottom w:val="single" w:sz="4" w:space="0" w:color="000000"/>
@@ -614,7 +602,7 @@
         <w:trPr/>
         <w:tc>
           <w:tcPr>
-            <w:tcW w:w="2159" w:type="dxa"/>
+            <w:tcW w:w="2158" w:type="dxa"/>
             <w:tcBorders>
               <w:left w:val="single" w:sz="4" w:space="0" w:color="000000"/>
               <w:bottom w:val="single" w:sz="4" w:space="0" w:color="000000"/>
@@ -641,7 +629,7 @@
         </w:tc>
         <w:tc>
           <w:tcPr>
-            <w:tcW w:w="2110" w:type="dxa"/>
+            <w:tcW w:w="2111" w:type="dxa"/>
             <w:tcBorders>
               <w:left w:val="single" w:sz="4" w:space="0" w:color="000000"/>
               <w:bottom w:val="single" w:sz="4" w:space="0" w:color="000000"/>
@@ -723,7 +711,7 @@
         <w:trPr/>
         <w:tc>
           <w:tcPr>
-            <w:tcW w:w="2159" w:type="dxa"/>
+            <w:tcW w:w="2158" w:type="dxa"/>
             <w:tcBorders>
               <w:left w:val="single" w:sz="4" w:space="0" w:color="000000"/>
               <w:bottom w:val="single" w:sz="4" w:space="0" w:color="000000"/>
@@ -768,7 +756,7 @@
         </w:tc>
         <w:tc>
           <w:tcPr>
-            <w:tcW w:w="2110" w:type="dxa"/>
+            <w:tcW w:w="2111" w:type="dxa"/>
             <w:tcBorders>
               <w:left w:val="single" w:sz="4" w:space="0" w:color="000000"/>
               <w:bottom w:val="single" w:sz="4" w:space="0" w:color="000000"/>
@@ -850,7 +838,7 @@
         <w:trPr/>
         <w:tc>
           <w:tcPr>
-            <w:tcW w:w="2159" w:type="dxa"/>
+            <w:tcW w:w="2158" w:type="dxa"/>
             <w:tcBorders>
               <w:left w:val="single" w:sz="4" w:space="0" w:color="000000"/>
               <w:bottom w:val="single" w:sz="4" w:space="0" w:color="000000"/>
@@ -895,7 +883,7 @@
         </w:tc>
         <w:tc>
           <w:tcPr>
-            <w:tcW w:w="2110" w:type="dxa"/>
+            <w:tcW w:w="2111" w:type="dxa"/>
             <w:tcBorders>
               <w:left w:val="single" w:sz="4" w:space="0" w:color="000000"/>
               <w:bottom w:val="single" w:sz="4" w:space="0" w:color="000000"/>
@@ -977,7 +965,7 @@
         <w:trPr/>
         <w:tc>
           <w:tcPr>
-            <w:tcW w:w="2159" w:type="dxa"/>
+            <w:tcW w:w="2158" w:type="dxa"/>
             <w:tcBorders>
               <w:left w:val="single" w:sz="4" w:space="0" w:color="000000"/>
               <w:bottom w:val="single" w:sz="4" w:space="0" w:color="000000"/>
@@ -1007,7 +995,7 @@
         </w:tc>
         <w:tc>
           <w:tcPr>
-            <w:tcW w:w="2110" w:type="dxa"/>
+            <w:tcW w:w="2111" w:type="dxa"/>
             <w:tcBorders>
               <w:left w:val="single" w:sz="4" w:space="0" w:color="000000"/>
               <w:bottom w:val="single" w:sz="4" w:space="0" w:color="000000"/>
@@ -1089,7 +1077,7 @@
         <w:trPr/>
         <w:tc>
           <w:tcPr>
-            <w:tcW w:w="2159" w:type="dxa"/>
+            <w:tcW w:w="2158" w:type="dxa"/>
             <w:tcBorders>
               <w:left w:val="single" w:sz="4" w:space="0" w:color="000000"/>
               <w:bottom w:val="single" w:sz="4" w:space="0" w:color="000000"/>
@@ -1116,7 +1104,7 @@
         </w:tc>
         <w:tc>
           <w:tcPr>
-            <w:tcW w:w="2110" w:type="dxa"/>
+            <w:tcW w:w="2111" w:type="dxa"/>
             <w:tcBorders>
               <w:left w:val="single" w:sz="4" w:space="0" w:color="000000"/>
               <w:bottom w:val="single" w:sz="4" w:space="0" w:color="000000"/>
@@ -1198,7 +1186,7 @@
         <w:trPr/>
         <w:tc>
           <w:tcPr>
-            <w:tcW w:w="2159" w:type="dxa"/>
+            <w:tcW w:w="2158" w:type="dxa"/>
             <w:tcBorders>
               <w:left w:val="single" w:sz="4" w:space="0" w:color="000000"/>
               <w:bottom w:val="single" w:sz="4" w:space="0" w:color="000000"/>
@@ -1225,7 +1213,7 @@
         </w:tc>
         <w:tc>
           <w:tcPr>
-            <w:tcW w:w="2110" w:type="dxa"/>
+            <w:tcW w:w="2111" w:type="dxa"/>
             <w:tcBorders>
               <w:left w:val="single" w:sz="4" w:space="0" w:color="000000"/>
               <w:bottom w:val="single" w:sz="4" w:space="0" w:color="000000"/>
@@ -1307,7 +1295,7 @@
         <w:trPr/>
         <w:tc>
           <w:tcPr>
-            <w:tcW w:w="2159" w:type="dxa"/>
+            <w:tcW w:w="2158" w:type="dxa"/>
             <w:tcBorders>
               <w:left w:val="single" w:sz="4" w:space="0" w:color="000000"/>
               <w:bottom w:val="single" w:sz="4" w:space="0" w:color="000000"/>
@@ -1352,7 +1340,7 @@
         </w:tc>
         <w:tc>
           <w:tcPr>
-            <w:tcW w:w="2110" w:type="dxa"/>
+            <w:tcW w:w="2111" w:type="dxa"/>
             <w:tcBorders>
               <w:left w:val="single" w:sz="4" w:space="0" w:color="000000"/>
               <w:bottom w:val="single" w:sz="4" w:space="0" w:color="000000"/>
@@ -1434,7 +1422,7 @@
         <w:trPr/>
         <w:tc>
           <w:tcPr>
-            <w:tcW w:w="2159" w:type="dxa"/>
+            <w:tcW w:w="2158" w:type="dxa"/>
             <w:tcBorders>
               <w:left w:val="single" w:sz="4" w:space="0" w:color="000000"/>
               <w:bottom w:val="single" w:sz="4" w:space="0" w:color="000000"/>
@@ -1479,7 +1467,7 @@
         </w:tc>
         <w:tc>
           <w:tcPr>
-            <w:tcW w:w="2110" w:type="dxa"/>
+            <w:tcW w:w="2111" w:type="dxa"/>
             <w:tcBorders>
               <w:left w:val="single" w:sz="4" w:space="0" w:color="000000"/>
               <w:bottom w:val="single" w:sz="4" w:space="0" w:color="000000"/>
@@ -1561,7 +1549,7 @@
         <w:trPr/>
         <w:tc>
           <w:tcPr>
-            <w:tcW w:w="2159" w:type="dxa"/>
+            <w:tcW w:w="2158" w:type="dxa"/>
             <w:tcBorders>
               <w:left w:val="single" w:sz="4" w:space="0" w:color="000000"/>
               <w:bottom w:val="single" w:sz="4" w:space="0" w:color="000000"/>
@@ -1588,7 +1576,7 @@
         </w:tc>
         <w:tc>
           <w:tcPr>
-            <w:tcW w:w="2110" w:type="dxa"/>
+            <w:tcW w:w="2111" w:type="dxa"/>
             <w:tcBorders>
               <w:left w:val="single" w:sz="4" w:space="0" w:color="000000"/>
               <w:bottom w:val="single" w:sz="4" w:space="0" w:color="000000"/>
@@ -1692,11 +1680,7 @@
       </w:pPr>
       <w:r>
         <w:rPr/>
-        <w:t xml:space="preserve">3.- </w:t>
-      </w:r>
-      <w:r>
-        <w:rPr/>
-        <w:t>Lengua en la que está la cédula*:</w:t>
+        <w:t>3.- Lengua en la que está la cédula*:</w:t>
       </w:r>
     </w:p>
     <w:p>
@@ -1740,11 +1724,7 @@
       </w:pPr>
       <w:r>
         <w:rPr/>
-        <w:t xml:space="preserve">4.- </w:t>
-      </w:r>
-      <w:r>
-        <w:rPr/>
-        <w:t>Título de la cédula*:</w:t>
+        <w:t>4.- Título de la cédula*:</w:t>
       </w:r>
     </w:p>
     <w:p>
@@ -1788,11 +1768,7 @@
       </w:pPr>
       <w:r>
         <w:rPr/>
-        <w:t xml:space="preserve">5.- </w:t>
-      </w:r>
-      <w:r>
-        <w:rPr/>
-        <w:t>Resumen de la cédula</w:t>
+        <w:t>5.- Resumen de la cédula</w:t>
       </w:r>
       <w:r>
         <w:rPr>
@@ -1843,11 +1819,21 @@
       </w:pPr>
       <w:r>
         <w:rPr/>
-        <w:t xml:space="preserve">6.- </w:t>
+        <w:t xml:space="preserve">6.- Indicar una* o más ubicaciones geográficas </w:t>
       </w:r>
       <w:r>
         <w:rPr/>
-        <w:t>Indicar una* o más ubicaciones geográficas de la cédula:</w:t>
+        <w:t>que se abordan en</w:t>
+      </w:r>
+      <w:r>
+        <w:rPr>
+          <w:u w:val="none"/>
+        </w:rPr>
+        <w:t xml:space="preserve"> </w:t>
+      </w:r>
+      <w:r>
+        <w:rPr/>
+        <w:t>la cédula:</w:t>
       </w:r>
     </w:p>
     <w:tbl>
@@ -1867,8 +1853,8 @@
         <w:gridCol w:w="1250"/>
         <w:gridCol w:w="1699"/>
         <w:gridCol w:w="1850"/>
-        <w:gridCol w:w="1851"/>
-        <w:gridCol w:w="1859"/>
+        <w:gridCol w:w="1852"/>
+        <w:gridCol w:w="1858"/>
         <w:gridCol w:w="1850"/>
       </w:tblGrid>
       <w:tr>
@@ -1946,7 +1932,7 @@
         </w:tc>
         <w:tc>
           <w:tcPr>
-            <w:tcW w:w="1851" w:type="dxa"/>
+            <w:tcW w:w="1852" w:type="dxa"/>
             <w:tcBorders>
               <w:top w:val="single" w:sz="4" w:space="0" w:color="000000"/>
               <w:left w:val="single" w:sz="4" w:space="0" w:color="000000"/>
@@ -1969,7 +1955,7 @@
         </w:tc>
         <w:tc>
           <w:tcPr>
-            <w:tcW w:w="1859" w:type="dxa"/>
+            <w:tcW w:w="1858" w:type="dxa"/>
             <w:tcBorders>
               <w:top w:val="single" w:sz="4" w:space="0" w:color="000000"/>
               <w:left w:val="single" w:sz="4" w:space="0" w:color="000000"/>
@@ -2090,29 +2076,29 @@
         </w:tc>
         <w:tc>
           <w:tcPr>
-            <w:tcW w:w="1851" w:type="dxa"/>
-            <w:tcBorders>
-              <w:left w:val="single" w:sz="4" w:space="0" w:color="000000"/>
-              <w:bottom w:val="single" w:sz="4" w:space="0" w:color="000000"/>
-            </w:tcBorders>
-          </w:tcPr>
-          <w:p>
-            <w:pPr>
-              <w:pStyle w:val="Contenidodelatabla"/>
-              <w:widowControl w:val="false"/>
-              <w:suppressLineNumbers/>
-              <w:bidi w:val="0"/>
-              <w:jc w:val="left"/>
-              <w:rPr/>
-            </w:pPr>
-            <w:r>
-              <w:rPr/>
-            </w:r>
-          </w:p>
-        </w:tc>
-        <w:tc>
-          <w:tcPr>
-            <w:tcW w:w="1859" w:type="dxa"/>
+            <w:tcW w:w="1852" w:type="dxa"/>
+            <w:tcBorders>
+              <w:left w:val="single" w:sz="4" w:space="0" w:color="000000"/>
+              <w:bottom w:val="single" w:sz="4" w:space="0" w:color="000000"/>
+            </w:tcBorders>
+          </w:tcPr>
+          <w:p>
+            <w:pPr>
+              <w:pStyle w:val="Contenidodelatabla"/>
+              <w:widowControl w:val="false"/>
+              <w:suppressLineNumbers/>
+              <w:bidi w:val="0"/>
+              <w:jc w:val="left"/>
+              <w:rPr/>
+            </w:pPr>
+            <w:r>
+              <w:rPr/>
+            </w:r>
+          </w:p>
+        </w:tc>
+        <w:tc>
+          <w:tcPr>
+            <w:tcW w:w="1858" w:type="dxa"/>
             <w:tcBorders>
               <w:left w:val="single" w:sz="4" w:space="0" w:color="000000"/>
               <w:bottom w:val="single" w:sz="4" w:space="0" w:color="000000"/>
@@ -2249,29 +2235,29 @@
         </w:tc>
         <w:tc>
           <w:tcPr>
-            <w:tcW w:w="1851" w:type="dxa"/>
-            <w:tcBorders>
-              <w:left w:val="single" w:sz="4" w:space="0" w:color="000000"/>
-              <w:bottom w:val="single" w:sz="4" w:space="0" w:color="000000"/>
-            </w:tcBorders>
-          </w:tcPr>
-          <w:p>
-            <w:pPr>
-              <w:pStyle w:val="Contenidodelatabla"/>
-              <w:widowControl w:val="false"/>
-              <w:suppressLineNumbers/>
-              <w:bidi w:val="0"/>
-              <w:jc w:val="left"/>
-              <w:rPr/>
-            </w:pPr>
-            <w:r>
-              <w:rPr/>
-            </w:r>
-          </w:p>
-        </w:tc>
-        <w:tc>
-          <w:tcPr>
-            <w:tcW w:w="1859" w:type="dxa"/>
+            <w:tcW w:w="1852" w:type="dxa"/>
+            <w:tcBorders>
+              <w:left w:val="single" w:sz="4" w:space="0" w:color="000000"/>
+              <w:bottom w:val="single" w:sz="4" w:space="0" w:color="000000"/>
+            </w:tcBorders>
+          </w:tcPr>
+          <w:p>
+            <w:pPr>
+              <w:pStyle w:val="Contenidodelatabla"/>
+              <w:widowControl w:val="false"/>
+              <w:suppressLineNumbers/>
+              <w:bidi w:val="0"/>
+              <w:jc w:val="left"/>
+              <w:rPr/>
+            </w:pPr>
+            <w:r>
+              <w:rPr/>
+            </w:r>
+          </w:p>
+        </w:tc>
+        <w:tc>
+          <w:tcPr>
+            <w:tcW w:w="1858" w:type="dxa"/>
             <w:tcBorders>
               <w:left w:val="single" w:sz="4" w:space="0" w:color="000000"/>
               <w:bottom w:val="single" w:sz="4" w:space="0" w:color="000000"/>
@@ -2408,29 +2394,29 @@
         </w:tc>
         <w:tc>
           <w:tcPr>
-            <w:tcW w:w="1851" w:type="dxa"/>
-            <w:tcBorders>
-              <w:left w:val="single" w:sz="4" w:space="0" w:color="000000"/>
-              <w:bottom w:val="single" w:sz="4" w:space="0" w:color="000000"/>
-            </w:tcBorders>
-          </w:tcPr>
-          <w:p>
-            <w:pPr>
-              <w:pStyle w:val="Contenidodelatabla"/>
-              <w:widowControl w:val="false"/>
-              <w:suppressLineNumbers/>
-              <w:bidi w:val="0"/>
-              <w:jc w:val="left"/>
-              <w:rPr/>
-            </w:pPr>
-            <w:r>
-              <w:rPr/>
-            </w:r>
-          </w:p>
-        </w:tc>
-        <w:tc>
-          <w:tcPr>
-            <w:tcW w:w="1859" w:type="dxa"/>
+            <w:tcW w:w="1852" w:type="dxa"/>
+            <w:tcBorders>
+              <w:left w:val="single" w:sz="4" w:space="0" w:color="000000"/>
+              <w:bottom w:val="single" w:sz="4" w:space="0" w:color="000000"/>
+            </w:tcBorders>
+          </w:tcPr>
+          <w:p>
+            <w:pPr>
+              <w:pStyle w:val="Contenidodelatabla"/>
+              <w:widowControl w:val="false"/>
+              <w:suppressLineNumbers/>
+              <w:bidi w:val="0"/>
+              <w:jc w:val="left"/>
+              <w:rPr/>
+            </w:pPr>
+            <w:r>
+              <w:rPr/>
+            </w:r>
+          </w:p>
+        </w:tc>
+        <w:tc>
+          <w:tcPr>
+            <w:tcW w:w="1858" w:type="dxa"/>
             <w:tcBorders>
               <w:left w:val="single" w:sz="4" w:space="0" w:color="000000"/>
               <w:bottom w:val="single" w:sz="4" w:space="0" w:color="000000"/>
@@ -2567,29 +2553,29 @@
         </w:tc>
         <w:tc>
           <w:tcPr>
-            <w:tcW w:w="1851" w:type="dxa"/>
-            <w:tcBorders>
-              <w:left w:val="single" w:sz="4" w:space="0" w:color="000000"/>
-              <w:bottom w:val="single" w:sz="4" w:space="0" w:color="000000"/>
-            </w:tcBorders>
-          </w:tcPr>
-          <w:p>
-            <w:pPr>
-              <w:pStyle w:val="Contenidodelatabla"/>
-              <w:widowControl w:val="false"/>
-              <w:suppressLineNumbers/>
-              <w:bidi w:val="0"/>
-              <w:jc w:val="left"/>
-              <w:rPr/>
-            </w:pPr>
-            <w:r>
-              <w:rPr/>
-            </w:r>
-          </w:p>
-        </w:tc>
-        <w:tc>
-          <w:tcPr>
-            <w:tcW w:w="1859" w:type="dxa"/>
+            <w:tcW w:w="1852" w:type="dxa"/>
+            <w:tcBorders>
+              <w:left w:val="single" w:sz="4" w:space="0" w:color="000000"/>
+              <w:bottom w:val="single" w:sz="4" w:space="0" w:color="000000"/>
+            </w:tcBorders>
+          </w:tcPr>
+          <w:p>
+            <w:pPr>
+              <w:pStyle w:val="Contenidodelatabla"/>
+              <w:widowControl w:val="false"/>
+              <w:suppressLineNumbers/>
+              <w:bidi w:val="0"/>
+              <w:jc w:val="left"/>
+              <w:rPr/>
+            </w:pPr>
+            <w:r>
+              <w:rPr/>
+            </w:r>
+          </w:p>
+        </w:tc>
+        <w:tc>
+          <w:tcPr>
+            <w:tcW w:w="1858" w:type="dxa"/>
             <w:tcBorders>
               <w:left w:val="single" w:sz="4" w:space="0" w:color="000000"/>
               <w:bottom w:val="single" w:sz="4" w:space="0" w:color="000000"/>
@@ -2726,29 +2712,29 @@
         </w:tc>
         <w:tc>
           <w:tcPr>
-            <w:tcW w:w="1851" w:type="dxa"/>
-            <w:tcBorders>
-              <w:left w:val="single" w:sz="4" w:space="0" w:color="000000"/>
-              <w:bottom w:val="single" w:sz="4" w:space="0" w:color="000000"/>
-            </w:tcBorders>
-          </w:tcPr>
-          <w:p>
-            <w:pPr>
-              <w:pStyle w:val="Contenidodelatabla"/>
-              <w:widowControl w:val="false"/>
-              <w:suppressLineNumbers/>
-              <w:bidi w:val="0"/>
-              <w:jc w:val="left"/>
-              <w:rPr/>
-            </w:pPr>
-            <w:r>
-              <w:rPr/>
-            </w:r>
-          </w:p>
-        </w:tc>
-        <w:tc>
-          <w:tcPr>
-            <w:tcW w:w="1859" w:type="dxa"/>
+            <w:tcW w:w="1852" w:type="dxa"/>
+            <w:tcBorders>
+              <w:left w:val="single" w:sz="4" w:space="0" w:color="000000"/>
+              <w:bottom w:val="single" w:sz="4" w:space="0" w:color="000000"/>
+            </w:tcBorders>
+          </w:tcPr>
+          <w:p>
+            <w:pPr>
+              <w:pStyle w:val="Contenidodelatabla"/>
+              <w:widowControl w:val="false"/>
+              <w:suppressLineNumbers/>
+              <w:bidi w:val="0"/>
+              <w:jc w:val="left"/>
+              <w:rPr/>
+            </w:pPr>
+            <w:r>
+              <w:rPr/>
+            </w:r>
+          </w:p>
+        </w:tc>
+        <w:tc>
+          <w:tcPr>
+            <w:tcW w:w="1858" w:type="dxa"/>
             <w:tcBorders>
               <w:left w:val="single" w:sz="4" w:space="0" w:color="000000"/>
               <w:bottom w:val="single" w:sz="4" w:space="0" w:color="000000"/>
@@ -2885,29 +2871,29 @@
         </w:tc>
         <w:tc>
           <w:tcPr>
-            <w:tcW w:w="1851" w:type="dxa"/>
-            <w:tcBorders>
-              <w:left w:val="single" w:sz="4" w:space="0" w:color="000000"/>
-              <w:bottom w:val="single" w:sz="4" w:space="0" w:color="000000"/>
-            </w:tcBorders>
-          </w:tcPr>
-          <w:p>
-            <w:pPr>
-              <w:pStyle w:val="Contenidodelatabla"/>
-              <w:widowControl w:val="false"/>
-              <w:suppressLineNumbers/>
-              <w:bidi w:val="0"/>
-              <w:jc w:val="left"/>
-              <w:rPr/>
-            </w:pPr>
-            <w:r>
-              <w:rPr/>
-            </w:r>
-          </w:p>
-        </w:tc>
-        <w:tc>
-          <w:tcPr>
-            <w:tcW w:w="1859" w:type="dxa"/>
+            <w:tcW w:w="1852" w:type="dxa"/>
+            <w:tcBorders>
+              <w:left w:val="single" w:sz="4" w:space="0" w:color="000000"/>
+              <w:bottom w:val="single" w:sz="4" w:space="0" w:color="000000"/>
+            </w:tcBorders>
+          </w:tcPr>
+          <w:p>
+            <w:pPr>
+              <w:pStyle w:val="Contenidodelatabla"/>
+              <w:widowControl w:val="false"/>
+              <w:suppressLineNumbers/>
+              <w:bidi w:val="0"/>
+              <w:jc w:val="left"/>
+              <w:rPr/>
+            </w:pPr>
+            <w:r>
+              <w:rPr/>
+            </w:r>
+          </w:p>
+        </w:tc>
+        <w:tc>
+          <w:tcPr>
+            <w:tcW w:w="1858" w:type="dxa"/>
             <w:tcBorders>
               <w:left w:val="single" w:sz="4" w:space="0" w:color="000000"/>
               <w:bottom w:val="single" w:sz="4" w:space="0" w:color="000000"/>
@@ -3026,29 +3012,29 @@
         </w:tc>
         <w:tc>
           <w:tcPr>
-            <w:tcW w:w="1851" w:type="dxa"/>
-            <w:tcBorders>
-              <w:left w:val="single" w:sz="4" w:space="0" w:color="000000"/>
-              <w:bottom w:val="single" w:sz="4" w:space="0" w:color="000000"/>
-            </w:tcBorders>
-          </w:tcPr>
-          <w:p>
-            <w:pPr>
-              <w:pStyle w:val="Contenidodelatabla"/>
-              <w:widowControl w:val="false"/>
-              <w:suppressLineNumbers/>
-              <w:bidi w:val="0"/>
-              <w:jc w:val="left"/>
-              <w:rPr/>
-            </w:pPr>
-            <w:r>
-              <w:rPr/>
-            </w:r>
-          </w:p>
-        </w:tc>
-        <w:tc>
-          <w:tcPr>
-            <w:tcW w:w="1859" w:type="dxa"/>
+            <w:tcW w:w="1852" w:type="dxa"/>
+            <w:tcBorders>
+              <w:left w:val="single" w:sz="4" w:space="0" w:color="000000"/>
+              <w:bottom w:val="single" w:sz="4" w:space="0" w:color="000000"/>
+            </w:tcBorders>
+          </w:tcPr>
+          <w:p>
+            <w:pPr>
+              <w:pStyle w:val="Contenidodelatabla"/>
+              <w:widowControl w:val="false"/>
+              <w:suppressLineNumbers/>
+              <w:bidi w:val="0"/>
+              <w:jc w:val="left"/>
+              <w:rPr/>
+            </w:pPr>
+            <w:r>
+              <w:rPr/>
+            </w:r>
+          </w:p>
+        </w:tc>
+        <w:tc>
+          <w:tcPr>
+            <w:tcW w:w="1858" w:type="dxa"/>
             <w:tcBorders>
               <w:left w:val="single" w:sz="4" w:space="0" w:color="000000"/>
               <w:bottom w:val="single" w:sz="4" w:space="0" w:color="000000"/>
@@ -3129,19 +3115,11 @@
       </w:pPr>
       <w:r>
         <w:rPr/>
-        <w:t xml:space="preserve">7.- </w:t>
+        <w:t xml:space="preserve">7.- Indicar uno o más nombres comunes </w:t>
       </w:r>
       <w:r>
         <w:rPr/>
-        <w:t xml:space="preserve">Indicar uno o más nombres comunes, palabras clave o alias de la cédula* </w:t>
-      </w:r>
-      <w:r>
-        <w:rPr/>
-        <w:t>(palabras con las que los visitantes van a encontrar la cédula)</w:t>
-      </w:r>
-      <w:r>
-        <w:rPr/>
-        <w:t>:</w:t>
+        <w:t>(en caso de haberlos):</w:t>
       </w:r>
     </w:p>
     <w:p>
@@ -3175,11 +3153,49 @@
       </w:pPr>
       <w:r>
         <w:rPr/>
-        <w:t xml:space="preserve">8.- </w:t>
+        <w:t>8.- Indicar uno o más</w:t>
       </w:r>
       <w:r>
         <w:rPr/>
-        <w:t>En caso de haberlas, indicar una o más especies abordadas en la cédula:</w:t>
+        <w:t xml:space="preserve"> palabras clave o alias de la cédula* (palabras con las que los visitantes van a encontrar la cédula):</w:t>
+      </w:r>
+    </w:p>
+    <w:p>
+      <w:pPr>
+        <w:pStyle w:val="Normal"/>
+        <w:bidi w:val="0"/>
+        <w:jc w:val="left"/>
+        <w:rPr/>
+      </w:pPr>
+      <w:r>
+        <w:rPr/>
+      </w:r>
+    </w:p>
+    <w:p>
+      <w:pPr>
+        <w:pStyle w:val="Normal"/>
+        <w:bidi w:val="0"/>
+        <w:jc w:val="left"/>
+        <w:rPr/>
+      </w:pPr>
+      <w:r>
+        <w:rPr/>
+      </w:r>
+    </w:p>
+    <w:p>
+      <w:pPr>
+        <w:pStyle w:val="Normal"/>
+        <w:bidi w:val="0"/>
+        <w:jc w:val="left"/>
+        <w:rPr/>
+      </w:pPr>
+      <w:r>
+        <w:rPr/>
+        <w:t>9</w:t>
+      </w:r>
+      <w:r>
+        <w:rPr/>
+        <w:t>.- En caso de haberlas, indicar una o más especies abordadas en la cédula:</w:t>
       </w:r>
     </w:p>
     <w:tbl>
@@ -3197,10 +3213,10 @@
       </w:tblPr>
       <w:tblGrid>
         <w:gridCol w:w="1590"/>
-        <w:gridCol w:w="2079"/>
+        <w:gridCol w:w="2078"/>
         <w:gridCol w:w="2220"/>
         <w:gridCol w:w="2220"/>
-        <w:gridCol w:w="2231"/>
+        <w:gridCol w:w="2232"/>
       </w:tblGrid>
       <w:tr>
         <w:trPr/>
@@ -3233,7 +3249,7 @@
         </w:tc>
         <w:tc>
           <w:tcPr>
-            <w:tcW w:w="2079" w:type="dxa"/>
+            <w:tcW w:w="2078" w:type="dxa"/>
             <w:tcBorders>
               <w:top w:val="single" w:sz="4" w:space="0" w:color="000000"/>
               <w:left w:val="single" w:sz="4" w:space="0" w:color="000000"/>
@@ -3299,7 +3315,7 @@
         </w:tc>
         <w:tc>
           <w:tcPr>
-            <w:tcW w:w="2231" w:type="dxa"/>
+            <w:tcW w:w="2232" w:type="dxa"/>
             <w:tcBorders>
               <w:top w:val="single" w:sz="4" w:space="0" w:color="000000"/>
               <w:left w:val="single" w:sz="4" w:space="0" w:color="000000"/>
@@ -3352,7 +3368,7 @@
         </w:tc>
         <w:tc>
           <w:tcPr>
-            <w:tcW w:w="2079" w:type="dxa"/>
+            <w:tcW w:w="2078" w:type="dxa"/>
             <w:tcBorders>
               <w:left w:val="single" w:sz="4" w:space="0" w:color="000000"/>
               <w:bottom w:val="single" w:sz="4" w:space="0" w:color="000000"/>
@@ -3418,7 +3434,7 @@
         </w:tc>
         <w:tc>
           <w:tcPr>
-            <w:tcW w:w="2231" w:type="dxa"/>
+            <w:tcW w:w="2232" w:type="dxa"/>
             <w:tcBorders>
               <w:left w:val="single" w:sz="4" w:space="0" w:color="000000"/>
               <w:bottom w:val="single" w:sz="4" w:space="0" w:color="000000"/>
@@ -3471,7 +3487,7 @@
         </w:tc>
         <w:tc>
           <w:tcPr>
-            <w:tcW w:w="2079" w:type="dxa"/>
+            <w:tcW w:w="2078" w:type="dxa"/>
             <w:tcBorders>
               <w:left w:val="single" w:sz="4" w:space="0" w:color="000000"/>
               <w:bottom w:val="single" w:sz="4" w:space="0" w:color="000000"/>
@@ -3537,7 +3553,7 @@
         </w:tc>
         <w:tc>
           <w:tcPr>
-            <w:tcW w:w="2231" w:type="dxa"/>
+            <w:tcW w:w="2232" w:type="dxa"/>
             <w:tcBorders>
               <w:left w:val="single" w:sz="4" w:space="0" w:color="000000"/>
               <w:bottom w:val="single" w:sz="4" w:space="0" w:color="000000"/>
@@ -3608,7 +3624,7 @@
         </w:tc>
         <w:tc>
           <w:tcPr>
-            <w:tcW w:w="2079" w:type="dxa"/>
+            <w:tcW w:w="2078" w:type="dxa"/>
             <w:tcBorders>
               <w:left w:val="single" w:sz="4" w:space="0" w:color="000000"/>
               <w:bottom w:val="single" w:sz="4" w:space="0" w:color="000000"/>
@@ -3674,7 +3690,7 @@
         </w:tc>
         <w:tc>
           <w:tcPr>
-            <w:tcW w:w="2231" w:type="dxa"/>
+            <w:tcW w:w="2232" w:type="dxa"/>
             <w:tcBorders>
               <w:left w:val="single" w:sz="4" w:space="0" w:color="000000"/>
               <w:bottom w:val="single" w:sz="4" w:space="0" w:color="000000"/>
@@ -3729,7 +3745,7 @@
         </w:tc>
         <w:tc>
           <w:tcPr>
-            <w:tcW w:w="2079" w:type="dxa"/>
+            <w:tcW w:w="2078" w:type="dxa"/>
             <w:tcBorders>
               <w:left w:val="single" w:sz="4" w:space="0" w:color="000000"/>
               <w:bottom w:val="single" w:sz="4" w:space="0" w:color="000000"/>
@@ -3795,7 +3811,7 @@
         </w:tc>
         <w:tc>
           <w:tcPr>
-            <w:tcW w:w="2231" w:type="dxa"/>
+            <w:tcW w:w="2232" w:type="dxa"/>
             <w:tcBorders>
               <w:left w:val="single" w:sz="4" w:space="0" w:color="000000"/>
               <w:bottom w:val="single" w:sz="4" w:space="0" w:color="000000"/>
@@ -3866,7 +3882,7 @@
         </w:tc>
         <w:tc>
           <w:tcPr>
-            <w:tcW w:w="2079" w:type="dxa"/>
+            <w:tcW w:w="2078" w:type="dxa"/>
             <w:tcBorders>
               <w:left w:val="single" w:sz="4" w:space="0" w:color="000000"/>
               <w:bottom w:val="single" w:sz="4" w:space="0" w:color="000000"/>
@@ -3932,7 +3948,7 @@
         </w:tc>
         <w:tc>
           <w:tcPr>
-            <w:tcW w:w="2231" w:type="dxa"/>
+            <w:tcW w:w="2232" w:type="dxa"/>
             <w:tcBorders>
               <w:left w:val="single" w:sz="4" w:space="0" w:color="000000"/>
               <w:bottom w:val="single" w:sz="4" w:space="0" w:color="000000"/>
@@ -3985,7 +4001,7 @@
         </w:tc>
         <w:tc>
           <w:tcPr>
-            <w:tcW w:w="2079" w:type="dxa"/>
+            <w:tcW w:w="2078" w:type="dxa"/>
             <w:tcBorders>
               <w:left w:val="single" w:sz="4" w:space="0" w:color="000000"/>
               <w:bottom w:val="single" w:sz="4" w:space="0" w:color="000000"/>
@@ -4051,7 +4067,7 @@
         </w:tc>
         <w:tc>
           <w:tcPr>
-            <w:tcW w:w="2231" w:type="dxa"/>
+            <w:tcW w:w="2232" w:type="dxa"/>
             <w:tcBorders>
               <w:left w:val="single" w:sz="4" w:space="0" w:color="000000"/>
               <w:bottom w:val="single" w:sz="4" w:space="0" w:color="000000"/>
@@ -4104,7 +4120,7 @@
         </w:tc>
         <w:tc>
           <w:tcPr>
-            <w:tcW w:w="2079" w:type="dxa"/>
+            <w:tcW w:w="2078" w:type="dxa"/>
             <w:tcBorders>
               <w:left w:val="single" w:sz="4" w:space="0" w:color="000000"/>
               <w:bottom w:val="single" w:sz="4" w:space="0" w:color="000000"/>
@@ -4170,7 +4186,7 @@
         </w:tc>
         <w:tc>
           <w:tcPr>
-            <w:tcW w:w="2231" w:type="dxa"/>
+            <w:tcW w:w="2232" w:type="dxa"/>
             <w:tcBorders>
               <w:left w:val="single" w:sz="4" w:space="0" w:color="000000"/>
               <w:bottom w:val="single" w:sz="4" w:space="0" w:color="000000"/>
@@ -4223,7 +4239,7 @@
         </w:tc>
         <w:tc>
           <w:tcPr>
-            <w:tcW w:w="2079" w:type="dxa"/>
+            <w:tcW w:w="2078" w:type="dxa"/>
             <w:tcBorders>
               <w:left w:val="single" w:sz="4" w:space="0" w:color="000000"/>
               <w:bottom w:val="single" w:sz="4" w:space="0" w:color="000000"/>
@@ -4289,7 +4305,7 @@
         </w:tc>
         <w:tc>
           <w:tcPr>
-            <w:tcW w:w="2231" w:type="dxa"/>
+            <w:tcW w:w="2232" w:type="dxa"/>
             <w:tcBorders>
               <w:left w:val="single" w:sz="4" w:space="0" w:color="000000"/>
               <w:bottom w:val="single" w:sz="4" w:space="0" w:color="000000"/>
@@ -4337,6 +4353,1091 @@
       </w:pPr>
       <w:r>
         <w:rPr/>
+        <w:t>10.- Para las especies que registraste y que tengan algún uso, ve el catálogo anexo e indica:</w:t>
+      </w:r>
+    </w:p>
+    <w:tbl>
+      <w:tblPr>
+        <w:tblW w:w="10400" w:type="dxa"/>
+        <w:jc w:val="left"/>
+        <w:tblInd w:w="768" w:type="dxa"/>
+        <w:tblLayout w:type="fixed"/>
+        <w:tblCellMar>
+          <w:top w:w="55" w:type="dxa"/>
+          <w:left w:w="55" w:type="dxa"/>
+          <w:bottom w:w="55" w:type="dxa"/>
+          <w:right w:w="55" w:type="dxa"/>
+        </w:tblCellMar>
+      </w:tblPr>
+      <w:tblGrid>
+        <w:gridCol w:w="1140"/>
+        <w:gridCol w:w="1530"/>
+        <w:gridCol w:w="1870"/>
+        <w:gridCol w:w="1640"/>
+        <w:gridCol w:w="1590"/>
+        <w:gridCol w:w="1513"/>
+        <w:gridCol w:w="1117"/>
+      </w:tblGrid>
+      <w:tr>
+        <w:trPr/>
+        <w:tc>
+          <w:tcPr>
+            <w:tcW w:w="1140" w:type="dxa"/>
+            <w:tcBorders>
+              <w:top w:val="single" w:sz="4" w:space="0" w:color="000000"/>
+              <w:left w:val="single" w:sz="4" w:space="0" w:color="000000"/>
+              <w:bottom w:val="single" w:sz="4" w:space="0" w:color="000000"/>
+            </w:tcBorders>
+          </w:tcPr>
+          <w:p>
+            <w:pPr>
+              <w:pStyle w:val="Contenidodelatabla"/>
+              <w:rPr>
+                <w:sz w:val="20"/>
+                <w:szCs w:val="20"/>
+              </w:rPr>
+            </w:pPr>
+            <w:r>
+              <w:rPr>
+                <w:sz w:val="20"/>
+                <w:szCs w:val="20"/>
+              </w:rPr>
+            </w:r>
+          </w:p>
+        </w:tc>
+        <w:tc>
+          <w:tcPr>
+            <w:tcW w:w="1530" w:type="dxa"/>
+            <w:tcBorders>
+              <w:top w:val="single" w:sz="4" w:space="0" w:color="000000"/>
+              <w:left w:val="single" w:sz="4" w:space="0" w:color="000000"/>
+              <w:bottom w:val="single" w:sz="4" w:space="0" w:color="000000"/>
+            </w:tcBorders>
+          </w:tcPr>
+          <w:p>
+            <w:pPr>
+              <w:pStyle w:val="Contenidodelatabla"/>
+              <w:rPr>
+                <w:sz w:val="20"/>
+                <w:szCs w:val="20"/>
+              </w:rPr>
+            </w:pPr>
+            <w:r>
+              <w:rPr>
+                <w:sz w:val="20"/>
+                <w:szCs w:val="20"/>
+              </w:rPr>
+              <w:t>Uso1:</w:t>
+            </w:r>
+          </w:p>
+        </w:tc>
+        <w:tc>
+          <w:tcPr>
+            <w:tcW w:w="1870" w:type="dxa"/>
+            <w:tcBorders>
+              <w:top w:val="single" w:sz="4" w:space="0" w:color="000000"/>
+              <w:left w:val="single" w:sz="4" w:space="0" w:color="000000"/>
+              <w:bottom w:val="single" w:sz="4" w:space="0" w:color="000000"/>
+            </w:tcBorders>
+          </w:tcPr>
+          <w:p>
+            <w:pPr>
+              <w:pStyle w:val="Contenidodelatabla"/>
+              <w:rPr>
+                <w:sz w:val="20"/>
+                <w:szCs w:val="20"/>
+              </w:rPr>
+            </w:pPr>
+            <w:r>
+              <w:rPr>
+                <w:sz w:val="20"/>
+                <w:szCs w:val="20"/>
+              </w:rPr>
+              <w:t>Uso2:</w:t>
+            </w:r>
+          </w:p>
+        </w:tc>
+        <w:tc>
+          <w:tcPr>
+            <w:tcW w:w="1640" w:type="dxa"/>
+            <w:tcBorders>
+              <w:top w:val="single" w:sz="4" w:space="0" w:color="000000"/>
+              <w:left w:val="single" w:sz="4" w:space="0" w:color="000000"/>
+              <w:bottom w:val="single" w:sz="4" w:space="0" w:color="000000"/>
+            </w:tcBorders>
+          </w:tcPr>
+          <w:p>
+            <w:pPr>
+              <w:pStyle w:val="Contenidodelatabla"/>
+              <w:rPr>
+                <w:sz w:val="20"/>
+                <w:szCs w:val="20"/>
+              </w:rPr>
+            </w:pPr>
+            <w:r>
+              <w:rPr>
+                <w:sz w:val="20"/>
+                <w:szCs w:val="20"/>
+              </w:rPr>
+              <w:t>Uso3:</w:t>
+            </w:r>
+          </w:p>
+        </w:tc>
+        <w:tc>
+          <w:tcPr>
+            <w:tcW w:w="1590" w:type="dxa"/>
+            <w:tcBorders>
+              <w:top w:val="single" w:sz="4" w:space="0" w:color="000000"/>
+              <w:left w:val="single" w:sz="4" w:space="0" w:color="000000"/>
+              <w:bottom w:val="single" w:sz="4" w:space="0" w:color="000000"/>
+            </w:tcBorders>
+          </w:tcPr>
+          <w:p>
+            <w:pPr>
+              <w:pStyle w:val="Contenidodelatabla"/>
+              <w:rPr>
+                <w:sz w:val="20"/>
+                <w:szCs w:val="20"/>
+              </w:rPr>
+            </w:pPr>
+            <w:r>
+              <w:rPr>
+                <w:sz w:val="20"/>
+                <w:szCs w:val="20"/>
+              </w:rPr>
+              <w:t>Uso4:</w:t>
+            </w:r>
+          </w:p>
+        </w:tc>
+        <w:tc>
+          <w:tcPr>
+            <w:tcW w:w="1513" w:type="dxa"/>
+            <w:tcBorders>
+              <w:top w:val="single" w:sz="4" w:space="0" w:color="000000"/>
+              <w:left w:val="single" w:sz="4" w:space="0" w:color="000000"/>
+              <w:bottom w:val="single" w:sz="4" w:space="0" w:color="000000"/>
+            </w:tcBorders>
+          </w:tcPr>
+          <w:p>
+            <w:pPr>
+              <w:pStyle w:val="Contenidodelatabla"/>
+              <w:rPr>
+                <w:sz w:val="20"/>
+                <w:szCs w:val="20"/>
+              </w:rPr>
+            </w:pPr>
+            <w:r>
+              <w:rPr>
+                <w:sz w:val="20"/>
+                <w:szCs w:val="20"/>
+              </w:rPr>
+              <w:t>Uso5:</w:t>
+            </w:r>
+          </w:p>
+        </w:tc>
+        <w:tc>
+          <w:tcPr>
+            <w:tcW w:w="1117" w:type="dxa"/>
+            <w:tcBorders>
+              <w:top w:val="single" w:sz="4" w:space="0" w:color="000000"/>
+              <w:left w:val="single" w:sz="4" w:space="0" w:color="000000"/>
+              <w:bottom w:val="single" w:sz="4" w:space="0" w:color="000000"/>
+              <w:right w:val="single" w:sz="4" w:space="0" w:color="000000"/>
+            </w:tcBorders>
+          </w:tcPr>
+          <w:p>
+            <w:pPr>
+              <w:pStyle w:val="Contenidodelatabla"/>
+              <w:rPr>
+                <w:sz w:val="20"/>
+                <w:szCs w:val="20"/>
+              </w:rPr>
+            </w:pPr>
+            <w:r>
+              <w:rPr>
+                <w:sz w:val="20"/>
+                <w:szCs w:val="20"/>
+              </w:rPr>
+              <w:t>Uso6:</w:t>
+            </w:r>
+          </w:p>
+        </w:tc>
+      </w:tr>
+      <w:tr>
+        <w:trPr/>
+        <w:tc>
+          <w:tcPr>
+            <w:tcW w:w="1140" w:type="dxa"/>
+            <w:tcBorders>
+              <w:left w:val="single" w:sz="4" w:space="0" w:color="000000"/>
+              <w:bottom w:val="single" w:sz="4" w:space="0" w:color="000000"/>
+            </w:tcBorders>
+          </w:tcPr>
+          <w:p>
+            <w:pPr>
+              <w:pStyle w:val="Contenidodelatabla"/>
+              <w:rPr>
+                <w:sz w:val="20"/>
+                <w:szCs w:val="20"/>
+              </w:rPr>
+            </w:pPr>
+            <w:r>
+              <w:rPr>
+                <w:sz w:val="20"/>
+                <w:szCs w:val="20"/>
+              </w:rPr>
+              <w:t>Especie:</w:t>
+            </w:r>
+          </w:p>
+        </w:tc>
+        <w:tc>
+          <w:tcPr>
+            <w:tcW w:w="1530" w:type="dxa"/>
+            <w:tcBorders>
+              <w:left w:val="single" w:sz="4" w:space="0" w:color="000000"/>
+              <w:bottom w:val="single" w:sz="4" w:space="0" w:color="000000"/>
+            </w:tcBorders>
+          </w:tcPr>
+          <w:p>
+            <w:pPr>
+              <w:pStyle w:val="Contenidodelatabla"/>
+              <w:rPr>
+                <w:sz w:val="20"/>
+                <w:szCs w:val="20"/>
+              </w:rPr>
+            </w:pPr>
+            <w:r>
+              <w:rPr>
+                <w:sz w:val="20"/>
+                <w:szCs w:val="20"/>
+              </w:rPr>
+            </w:r>
+          </w:p>
+        </w:tc>
+        <w:tc>
+          <w:tcPr>
+            <w:tcW w:w="1870" w:type="dxa"/>
+            <w:tcBorders>
+              <w:left w:val="single" w:sz="4" w:space="0" w:color="000000"/>
+              <w:bottom w:val="single" w:sz="4" w:space="0" w:color="000000"/>
+            </w:tcBorders>
+          </w:tcPr>
+          <w:p>
+            <w:pPr>
+              <w:pStyle w:val="Contenidodelatabla"/>
+              <w:rPr>
+                <w:sz w:val="20"/>
+                <w:szCs w:val="20"/>
+              </w:rPr>
+            </w:pPr>
+            <w:r>
+              <w:rPr>
+                <w:sz w:val="20"/>
+                <w:szCs w:val="20"/>
+              </w:rPr>
+            </w:r>
+          </w:p>
+        </w:tc>
+        <w:tc>
+          <w:tcPr>
+            <w:tcW w:w="1640" w:type="dxa"/>
+            <w:tcBorders>
+              <w:left w:val="single" w:sz="4" w:space="0" w:color="000000"/>
+              <w:bottom w:val="single" w:sz="4" w:space="0" w:color="000000"/>
+            </w:tcBorders>
+          </w:tcPr>
+          <w:p>
+            <w:pPr>
+              <w:pStyle w:val="Contenidodelatabla"/>
+              <w:rPr>
+                <w:sz w:val="20"/>
+                <w:szCs w:val="20"/>
+              </w:rPr>
+            </w:pPr>
+            <w:r>
+              <w:rPr>
+                <w:sz w:val="20"/>
+                <w:szCs w:val="20"/>
+              </w:rPr>
+            </w:r>
+          </w:p>
+        </w:tc>
+        <w:tc>
+          <w:tcPr>
+            <w:tcW w:w="1590" w:type="dxa"/>
+            <w:tcBorders>
+              <w:left w:val="single" w:sz="4" w:space="0" w:color="000000"/>
+              <w:bottom w:val="single" w:sz="4" w:space="0" w:color="000000"/>
+            </w:tcBorders>
+          </w:tcPr>
+          <w:p>
+            <w:pPr>
+              <w:pStyle w:val="Contenidodelatabla"/>
+              <w:rPr>
+                <w:sz w:val="20"/>
+                <w:szCs w:val="20"/>
+              </w:rPr>
+            </w:pPr>
+            <w:r>
+              <w:rPr>
+                <w:sz w:val="20"/>
+                <w:szCs w:val="20"/>
+              </w:rPr>
+            </w:r>
+          </w:p>
+        </w:tc>
+        <w:tc>
+          <w:tcPr>
+            <w:tcW w:w="1513" w:type="dxa"/>
+            <w:tcBorders>
+              <w:left w:val="single" w:sz="4" w:space="0" w:color="000000"/>
+              <w:bottom w:val="single" w:sz="4" w:space="0" w:color="000000"/>
+            </w:tcBorders>
+          </w:tcPr>
+          <w:p>
+            <w:pPr>
+              <w:pStyle w:val="Contenidodelatabla"/>
+              <w:rPr>
+                <w:sz w:val="20"/>
+                <w:szCs w:val="20"/>
+              </w:rPr>
+            </w:pPr>
+            <w:r>
+              <w:rPr>
+                <w:sz w:val="20"/>
+                <w:szCs w:val="20"/>
+              </w:rPr>
+            </w:r>
+          </w:p>
+        </w:tc>
+        <w:tc>
+          <w:tcPr>
+            <w:tcW w:w="1117" w:type="dxa"/>
+            <w:tcBorders>
+              <w:left w:val="single" w:sz="4" w:space="0" w:color="000000"/>
+              <w:bottom w:val="single" w:sz="4" w:space="0" w:color="000000"/>
+              <w:right w:val="single" w:sz="4" w:space="0" w:color="000000"/>
+            </w:tcBorders>
+          </w:tcPr>
+          <w:p>
+            <w:pPr>
+              <w:pStyle w:val="Contenidodelatabla"/>
+              <w:rPr>
+                <w:sz w:val="20"/>
+                <w:szCs w:val="20"/>
+              </w:rPr>
+            </w:pPr>
+            <w:r>
+              <w:rPr>
+                <w:sz w:val="20"/>
+                <w:szCs w:val="20"/>
+              </w:rPr>
+            </w:r>
+          </w:p>
+        </w:tc>
+      </w:tr>
+      <w:tr>
+        <w:trPr/>
+        <w:tc>
+          <w:tcPr>
+            <w:tcW w:w="1140" w:type="dxa"/>
+            <w:tcBorders>
+              <w:left w:val="single" w:sz="4" w:space="0" w:color="000000"/>
+              <w:bottom w:val="single" w:sz="4" w:space="0" w:color="000000"/>
+            </w:tcBorders>
+          </w:tcPr>
+          <w:p>
+            <w:pPr>
+              <w:pStyle w:val="Contenidodelatabla"/>
+              <w:rPr>
+                <w:sz w:val="20"/>
+                <w:szCs w:val="20"/>
+              </w:rPr>
+            </w:pPr>
+            <w:r>
+              <w:rPr>
+                <w:sz w:val="20"/>
+                <w:szCs w:val="20"/>
+              </w:rPr>
+              <w:t>Categoría de uso:</w:t>
+            </w:r>
+          </w:p>
+        </w:tc>
+        <w:tc>
+          <w:tcPr>
+            <w:tcW w:w="1530" w:type="dxa"/>
+            <w:tcBorders>
+              <w:left w:val="single" w:sz="4" w:space="0" w:color="000000"/>
+              <w:bottom w:val="single" w:sz="4" w:space="0" w:color="000000"/>
+            </w:tcBorders>
+          </w:tcPr>
+          <w:p>
+            <w:pPr>
+              <w:pStyle w:val="Contenidodelatabla"/>
+              <w:rPr>
+                <w:sz w:val="20"/>
+                <w:szCs w:val="20"/>
+              </w:rPr>
+            </w:pPr>
+            <w:r>
+              <w:rPr>
+                <w:sz w:val="20"/>
+                <w:szCs w:val="20"/>
+              </w:rPr>
+            </w:r>
+          </w:p>
+        </w:tc>
+        <w:tc>
+          <w:tcPr>
+            <w:tcW w:w="1870" w:type="dxa"/>
+            <w:tcBorders>
+              <w:left w:val="single" w:sz="4" w:space="0" w:color="000000"/>
+              <w:bottom w:val="single" w:sz="4" w:space="0" w:color="000000"/>
+            </w:tcBorders>
+          </w:tcPr>
+          <w:p>
+            <w:pPr>
+              <w:pStyle w:val="Contenidodelatabla"/>
+              <w:rPr>
+                <w:sz w:val="20"/>
+                <w:szCs w:val="20"/>
+              </w:rPr>
+            </w:pPr>
+            <w:r>
+              <w:rPr>
+                <w:sz w:val="20"/>
+                <w:szCs w:val="20"/>
+              </w:rPr>
+            </w:r>
+          </w:p>
+        </w:tc>
+        <w:tc>
+          <w:tcPr>
+            <w:tcW w:w="1640" w:type="dxa"/>
+            <w:tcBorders>
+              <w:left w:val="single" w:sz="4" w:space="0" w:color="000000"/>
+              <w:bottom w:val="single" w:sz="4" w:space="0" w:color="000000"/>
+            </w:tcBorders>
+          </w:tcPr>
+          <w:p>
+            <w:pPr>
+              <w:pStyle w:val="Contenidodelatabla"/>
+              <w:rPr>
+                <w:sz w:val="20"/>
+                <w:szCs w:val="20"/>
+              </w:rPr>
+            </w:pPr>
+            <w:r>
+              <w:rPr>
+                <w:sz w:val="20"/>
+                <w:szCs w:val="20"/>
+              </w:rPr>
+            </w:r>
+          </w:p>
+        </w:tc>
+        <w:tc>
+          <w:tcPr>
+            <w:tcW w:w="1590" w:type="dxa"/>
+            <w:tcBorders>
+              <w:left w:val="single" w:sz="4" w:space="0" w:color="000000"/>
+              <w:bottom w:val="single" w:sz="4" w:space="0" w:color="000000"/>
+            </w:tcBorders>
+          </w:tcPr>
+          <w:p>
+            <w:pPr>
+              <w:pStyle w:val="Contenidodelatabla"/>
+              <w:rPr>
+                <w:sz w:val="20"/>
+                <w:szCs w:val="20"/>
+              </w:rPr>
+            </w:pPr>
+            <w:r>
+              <w:rPr>
+                <w:sz w:val="20"/>
+                <w:szCs w:val="20"/>
+              </w:rPr>
+            </w:r>
+          </w:p>
+        </w:tc>
+        <w:tc>
+          <w:tcPr>
+            <w:tcW w:w="1513" w:type="dxa"/>
+            <w:tcBorders>
+              <w:left w:val="single" w:sz="4" w:space="0" w:color="000000"/>
+              <w:bottom w:val="single" w:sz="4" w:space="0" w:color="000000"/>
+            </w:tcBorders>
+          </w:tcPr>
+          <w:p>
+            <w:pPr>
+              <w:pStyle w:val="Contenidodelatabla"/>
+              <w:rPr>
+                <w:sz w:val="20"/>
+                <w:szCs w:val="20"/>
+              </w:rPr>
+            </w:pPr>
+            <w:r>
+              <w:rPr>
+                <w:sz w:val="20"/>
+                <w:szCs w:val="20"/>
+              </w:rPr>
+            </w:r>
+          </w:p>
+        </w:tc>
+        <w:tc>
+          <w:tcPr>
+            <w:tcW w:w="1117" w:type="dxa"/>
+            <w:tcBorders>
+              <w:left w:val="single" w:sz="4" w:space="0" w:color="000000"/>
+              <w:bottom w:val="single" w:sz="4" w:space="0" w:color="000000"/>
+              <w:right w:val="single" w:sz="4" w:space="0" w:color="000000"/>
+            </w:tcBorders>
+          </w:tcPr>
+          <w:p>
+            <w:pPr>
+              <w:pStyle w:val="Contenidodelatabla"/>
+              <w:rPr>
+                <w:sz w:val="20"/>
+                <w:szCs w:val="20"/>
+              </w:rPr>
+            </w:pPr>
+            <w:r>
+              <w:rPr>
+                <w:sz w:val="20"/>
+                <w:szCs w:val="20"/>
+              </w:rPr>
+            </w:r>
+          </w:p>
+        </w:tc>
+      </w:tr>
+      <w:tr>
+        <w:trPr/>
+        <w:tc>
+          <w:tcPr>
+            <w:tcW w:w="1140" w:type="dxa"/>
+            <w:tcBorders>
+              <w:left w:val="single" w:sz="4" w:space="0" w:color="000000"/>
+              <w:bottom w:val="single" w:sz="4" w:space="0" w:color="000000"/>
+            </w:tcBorders>
+          </w:tcPr>
+          <w:p>
+            <w:pPr>
+              <w:pStyle w:val="Contenidodelatabla"/>
+              <w:rPr>
+                <w:sz w:val="20"/>
+                <w:szCs w:val="20"/>
+              </w:rPr>
+            </w:pPr>
+            <w:r>
+              <w:rPr>
+                <w:sz w:val="20"/>
+                <w:szCs w:val="20"/>
+              </w:rPr>
+              <w:t>Uso:</w:t>
+            </w:r>
+          </w:p>
+        </w:tc>
+        <w:tc>
+          <w:tcPr>
+            <w:tcW w:w="1530" w:type="dxa"/>
+            <w:tcBorders>
+              <w:left w:val="single" w:sz="4" w:space="0" w:color="000000"/>
+              <w:bottom w:val="single" w:sz="4" w:space="0" w:color="000000"/>
+            </w:tcBorders>
+          </w:tcPr>
+          <w:p>
+            <w:pPr>
+              <w:pStyle w:val="Contenidodelatabla"/>
+              <w:rPr>
+                <w:sz w:val="20"/>
+                <w:szCs w:val="20"/>
+              </w:rPr>
+            </w:pPr>
+            <w:r>
+              <w:rPr>
+                <w:sz w:val="20"/>
+                <w:szCs w:val="20"/>
+              </w:rPr>
+            </w:r>
+          </w:p>
+        </w:tc>
+        <w:tc>
+          <w:tcPr>
+            <w:tcW w:w="1870" w:type="dxa"/>
+            <w:tcBorders>
+              <w:left w:val="single" w:sz="4" w:space="0" w:color="000000"/>
+              <w:bottom w:val="single" w:sz="4" w:space="0" w:color="000000"/>
+            </w:tcBorders>
+          </w:tcPr>
+          <w:p>
+            <w:pPr>
+              <w:pStyle w:val="Contenidodelatabla"/>
+              <w:rPr>
+                <w:sz w:val="20"/>
+                <w:szCs w:val="20"/>
+              </w:rPr>
+            </w:pPr>
+            <w:r>
+              <w:rPr>
+                <w:sz w:val="20"/>
+                <w:szCs w:val="20"/>
+              </w:rPr>
+            </w:r>
+          </w:p>
+        </w:tc>
+        <w:tc>
+          <w:tcPr>
+            <w:tcW w:w="1640" w:type="dxa"/>
+            <w:tcBorders>
+              <w:left w:val="single" w:sz="4" w:space="0" w:color="000000"/>
+              <w:bottom w:val="single" w:sz="4" w:space="0" w:color="000000"/>
+            </w:tcBorders>
+          </w:tcPr>
+          <w:p>
+            <w:pPr>
+              <w:pStyle w:val="Contenidodelatabla"/>
+              <w:rPr>
+                <w:sz w:val="20"/>
+                <w:szCs w:val="20"/>
+              </w:rPr>
+            </w:pPr>
+            <w:r>
+              <w:rPr>
+                <w:sz w:val="20"/>
+                <w:szCs w:val="20"/>
+              </w:rPr>
+            </w:r>
+          </w:p>
+        </w:tc>
+        <w:tc>
+          <w:tcPr>
+            <w:tcW w:w="1590" w:type="dxa"/>
+            <w:tcBorders>
+              <w:left w:val="single" w:sz="4" w:space="0" w:color="000000"/>
+              <w:bottom w:val="single" w:sz="4" w:space="0" w:color="000000"/>
+            </w:tcBorders>
+          </w:tcPr>
+          <w:p>
+            <w:pPr>
+              <w:pStyle w:val="Contenidodelatabla"/>
+              <w:rPr>
+                <w:sz w:val="20"/>
+                <w:szCs w:val="20"/>
+              </w:rPr>
+            </w:pPr>
+            <w:r>
+              <w:rPr>
+                <w:sz w:val="20"/>
+                <w:szCs w:val="20"/>
+              </w:rPr>
+            </w:r>
+          </w:p>
+        </w:tc>
+        <w:tc>
+          <w:tcPr>
+            <w:tcW w:w="1513" w:type="dxa"/>
+            <w:tcBorders>
+              <w:left w:val="single" w:sz="4" w:space="0" w:color="000000"/>
+              <w:bottom w:val="single" w:sz="4" w:space="0" w:color="000000"/>
+            </w:tcBorders>
+          </w:tcPr>
+          <w:p>
+            <w:pPr>
+              <w:pStyle w:val="Contenidodelatabla"/>
+              <w:rPr>
+                <w:sz w:val="20"/>
+                <w:szCs w:val="20"/>
+              </w:rPr>
+            </w:pPr>
+            <w:r>
+              <w:rPr>
+                <w:sz w:val="20"/>
+                <w:szCs w:val="20"/>
+              </w:rPr>
+            </w:r>
+          </w:p>
+        </w:tc>
+        <w:tc>
+          <w:tcPr>
+            <w:tcW w:w="1117" w:type="dxa"/>
+            <w:tcBorders>
+              <w:left w:val="single" w:sz="4" w:space="0" w:color="000000"/>
+              <w:bottom w:val="single" w:sz="4" w:space="0" w:color="000000"/>
+              <w:right w:val="single" w:sz="4" w:space="0" w:color="000000"/>
+            </w:tcBorders>
+          </w:tcPr>
+          <w:p>
+            <w:pPr>
+              <w:pStyle w:val="Contenidodelatabla"/>
+              <w:rPr>
+                <w:sz w:val="20"/>
+                <w:szCs w:val="20"/>
+              </w:rPr>
+            </w:pPr>
+            <w:r>
+              <w:rPr>
+                <w:sz w:val="20"/>
+                <w:szCs w:val="20"/>
+              </w:rPr>
+            </w:r>
+          </w:p>
+        </w:tc>
+      </w:tr>
+      <w:tr>
+        <w:trPr/>
+        <w:tc>
+          <w:tcPr>
+            <w:tcW w:w="1140" w:type="dxa"/>
+            <w:tcBorders>
+              <w:left w:val="single" w:sz="4" w:space="0" w:color="000000"/>
+              <w:bottom w:val="single" w:sz="4" w:space="0" w:color="000000"/>
+            </w:tcBorders>
+          </w:tcPr>
+          <w:p>
+            <w:pPr>
+              <w:pStyle w:val="Contenidodelatabla"/>
+              <w:rPr>
+                <w:sz w:val="20"/>
+                <w:szCs w:val="20"/>
+              </w:rPr>
+            </w:pPr>
+            <w:r>
+              <w:rPr>
+                <w:sz w:val="20"/>
+                <w:szCs w:val="20"/>
+              </w:rPr>
+              <w:t>Parte:</w:t>
+            </w:r>
+          </w:p>
+        </w:tc>
+        <w:tc>
+          <w:tcPr>
+            <w:tcW w:w="1530" w:type="dxa"/>
+            <w:tcBorders>
+              <w:left w:val="single" w:sz="4" w:space="0" w:color="000000"/>
+              <w:bottom w:val="single" w:sz="4" w:space="0" w:color="000000"/>
+            </w:tcBorders>
+          </w:tcPr>
+          <w:p>
+            <w:pPr>
+              <w:pStyle w:val="Contenidodelatabla"/>
+              <w:rPr>
+                <w:sz w:val="20"/>
+                <w:szCs w:val="20"/>
+              </w:rPr>
+            </w:pPr>
+            <w:r>
+              <w:rPr>
+                <w:sz w:val="20"/>
+                <w:szCs w:val="20"/>
+              </w:rPr>
+            </w:r>
+          </w:p>
+        </w:tc>
+        <w:tc>
+          <w:tcPr>
+            <w:tcW w:w="1870" w:type="dxa"/>
+            <w:tcBorders>
+              <w:left w:val="single" w:sz="4" w:space="0" w:color="000000"/>
+              <w:bottom w:val="single" w:sz="4" w:space="0" w:color="000000"/>
+            </w:tcBorders>
+          </w:tcPr>
+          <w:p>
+            <w:pPr>
+              <w:pStyle w:val="Contenidodelatabla"/>
+              <w:rPr>
+                <w:sz w:val="20"/>
+                <w:szCs w:val="20"/>
+              </w:rPr>
+            </w:pPr>
+            <w:r>
+              <w:rPr>
+                <w:sz w:val="20"/>
+                <w:szCs w:val="20"/>
+              </w:rPr>
+            </w:r>
+          </w:p>
+        </w:tc>
+        <w:tc>
+          <w:tcPr>
+            <w:tcW w:w="1640" w:type="dxa"/>
+            <w:tcBorders>
+              <w:left w:val="single" w:sz="4" w:space="0" w:color="000000"/>
+              <w:bottom w:val="single" w:sz="4" w:space="0" w:color="000000"/>
+            </w:tcBorders>
+          </w:tcPr>
+          <w:p>
+            <w:pPr>
+              <w:pStyle w:val="Contenidodelatabla"/>
+              <w:rPr>
+                <w:sz w:val="20"/>
+                <w:szCs w:val="20"/>
+              </w:rPr>
+            </w:pPr>
+            <w:r>
+              <w:rPr>
+                <w:sz w:val="20"/>
+                <w:szCs w:val="20"/>
+              </w:rPr>
+            </w:r>
+          </w:p>
+        </w:tc>
+        <w:tc>
+          <w:tcPr>
+            <w:tcW w:w="1590" w:type="dxa"/>
+            <w:tcBorders>
+              <w:left w:val="single" w:sz="4" w:space="0" w:color="000000"/>
+              <w:bottom w:val="single" w:sz="4" w:space="0" w:color="000000"/>
+            </w:tcBorders>
+          </w:tcPr>
+          <w:p>
+            <w:pPr>
+              <w:pStyle w:val="Contenidodelatabla"/>
+              <w:rPr>
+                <w:sz w:val="20"/>
+                <w:szCs w:val="20"/>
+              </w:rPr>
+            </w:pPr>
+            <w:r>
+              <w:rPr>
+                <w:sz w:val="20"/>
+                <w:szCs w:val="20"/>
+              </w:rPr>
+            </w:r>
+          </w:p>
+        </w:tc>
+        <w:tc>
+          <w:tcPr>
+            <w:tcW w:w="1513" w:type="dxa"/>
+            <w:tcBorders>
+              <w:left w:val="single" w:sz="4" w:space="0" w:color="000000"/>
+              <w:bottom w:val="single" w:sz="4" w:space="0" w:color="000000"/>
+            </w:tcBorders>
+          </w:tcPr>
+          <w:p>
+            <w:pPr>
+              <w:pStyle w:val="Contenidodelatabla"/>
+              <w:rPr>
+                <w:sz w:val="20"/>
+                <w:szCs w:val="20"/>
+              </w:rPr>
+            </w:pPr>
+            <w:r>
+              <w:rPr>
+                <w:sz w:val="20"/>
+                <w:szCs w:val="20"/>
+              </w:rPr>
+            </w:r>
+          </w:p>
+        </w:tc>
+        <w:tc>
+          <w:tcPr>
+            <w:tcW w:w="1117" w:type="dxa"/>
+            <w:tcBorders>
+              <w:left w:val="single" w:sz="4" w:space="0" w:color="000000"/>
+              <w:bottom w:val="single" w:sz="4" w:space="0" w:color="000000"/>
+              <w:right w:val="single" w:sz="4" w:space="0" w:color="000000"/>
+            </w:tcBorders>
+          </w:tcPr>
+          <w:p>
+            <w:pPr>
+              <w:pStyle w:val="Contenidodelatabla"/>
+              <w:rPr>
+                <w:sz w:val="20"/>
+                <w:szCs w:val="20"/>
+              </w:rPr>
+            </w:pPr>
+            <w:r>
+              <w:rPr>
+                <w:sz w:val="20"/>
+                <w:szCs w:val="20"/>
+              </w:rPr>
+            </w:r>
+          </w:p>
+        </w:tc>
+      </w:tr>
+      <w:tr>
+        <w:trPr/>
+        <w:tc>
+          <w:tcPr>
+            <w:tcW w:w="1140" w:type="dxa"/>
+            <w:tcBorders>
+              <w:left w:val="single" w:sz="4" w:space="0" w:color="000000"/>
+              <w:bottom w:val="single" w:sz="4" w:space="0" w:color="000000"/>
+            </w:tcBorders>
+          </w:tcPr>
+          <w:p>
+            <w:pPr>
+              <w:pStyle w:val="Contenidodelatabla"/>
+              <w:rPr>
+                <w:sz w:val="20"/>
+                <w:szCs w:val="20"/>
+              </w:rPr>
+            </w:pPr>
+            <w:r>
+              <w:rPr>
+                <w:sz w:val="20"/>
+                <w:szCs w:val="20"/>
+              </w:rPr>
+              <w:t>Explica el uso:</w:t>
+            </w:r>
+          </w:p>
+        </w:tc>
+        <w:tc>
+          <w:tcPr>
+            <w:tcW w:w="1530" w:type="dxa"/>
+            <w:tcBorders>
+              <w:left w:val="single" w:sz="4" w:space="0" w:color="000000"/>
+              <w:bottom w:val="single" w:sz="4" w:space="0" w:color="000000"/>
+            </w:tcBorders>
+          </w:tcPr>
+          <w:p>
+            <w:pPr>
+              <w:pStyle w:val="Contenidodelatabla"/>
+              <w:rPr>
+                <w:sz w:val="20"/>
+                <w:szCs w:val="20"/>
+              </w:rPr>
+            </w:pPr>
+            <w:r>
+              <w:rPr>
+                <w:sz w:val="20"/>
+                <w:szCs w:val="20"/>
+              </w:rPr>
+            </w:r>
+          </w:p>
+        </w:tc>
+        <w:tc>
+          <w:tcPr>
+            <w:tcW w:w="1870" w:type="dxa"/>
+            <w:tcBorders>
+              <w:left w:val="single" w:sz="4" w:space="0" w:color="000000"/>
+              <w:bottom w:val="single" w:sz="4" w:space="0" w:color="000000"/>
+            </w:tcBorders>
+          </w:tcPr>
+          <w:p>
+            <w:pPr>
+              <w:pStyle w:val="Contenidodelatabla"/>
+              <w:rPr>
+                <w:sz w:val="20"/>
+                <w:szCs w:val="20"/>
+              </w:rPr>
+            </w:pPr>
+            <w:r>
+              <w:rPr>
+                <w:sz w:val="20"/>
+                <w:szCs w:val="20"/>
+              </w:rPr>
+            </w:r>
+          </w:p>
+        </w:tc>
+        <w:tc>
+          <w:tcPr>
+            <w:tcW w:w="1640" w:type="dxa"/>
+            <w:tcBorders>
+              <w:left w:val="single" w:sz="4" w:space="0" w:color="000000"/>
+              <w:bottom w:val="single" w:sz="4" w:space="0" w:color="000000"/>
+            </w:tcBorders>
+          </w:tcPr>
+          <w:p>
+            <w:pPr>
+              <w:pStyle w:val="Contenidodelatabla"/>
+              <w:rPr>
+                <w:sz w:val="20"/>
+                <w:szCs w:val="20"/>
+              </w:rPr>
+            </w:pPr>
+            <w:r>
+              <w:rPr>
+                <w:sz w:val="20"/>
+                <w:szCs w:val="20"/>
+              </w:rPr>
+            </w:r>
+          </w:p>
+        </w:tc>
+        <w:tc>
+          <w:tcPr>
+            <w:tcW w:w="1590" w:type="dxa"/>
+            <w:tcBorders>
+              <w:left w:val="single" w:sz="4" w:space="0" w:color="000000"/>
+              <w:bottom w:val="single" w:sz="4" w:space="0" w:color="000000"/>
+            </w:tcBorders>
+          </w:tcPr>
+          <w:p>
+            <w:pPr>
+              <w:pStyle w:val="Contenidodelatabla"/>
+              <w:rPr>
+                <w:sz w:val="20"/>
+                <w:szCs w:val="20"/>
+              </w:rPr>
+            </w:pPr>
+            <w:r>
+              <w:rPr>
+                <w:sz w:val="20"/>
+                <w:szCs w:val="20"/>
+              </w:rPr>
+            </w:r>
+          </w:p>
+        </w:tc>
+        <w:tc>
+          <w:tcPr>
+            <w:tcW w:w="1513" w:type="dxa"/>
+            <w:tcBorders>
+              <w:left w:val="single" w:sz="4" w:space="0" w:color="000000"/>
+              <w:bottom w:val="single" w:sz="4" w:space="0" w:color="000000"/>
+            </w:tcBorders>
+          </w:tcPr>
+          <w:p>
+            <w:pPr>
+              <w:pStyle w:val="Contenidodelatabla"/>
+              <w:rPr>
+                <w:sz w:val="20"/>
+                <w:szCs w:val="20"/>
+              </w:rPr>
+            </w:pPr>
+            <w:r>
+              <w:rPr>
+                <w:sz w:val="20"/>
+                <w:szCs w:val="20"/>
+              </w:rPr>
+            </w:r>
+          </w:p>
+        </w:tc>
+        <w:tc>
+          <w:tcPr>
+            <w:tcW w:w="1117" w:type="dxa"/>
+            <w:tcBorders>
+              <w:left w:val="single" w:sz="4" w:space="0" w:color="000000"/>
+              <w:bottom w:val="single" w:sz="4" w:space="0" w:color="000000"/>
+              <w:right w:val="single" w:sz="4" w:space="0" w:color="000000"/>
+            </w:tcBorders>
+          </w:tcPr>
+          <w:p>
+            <w:pPr>
+              <w:pStyle w:val="Contenidodelatabla"/>
+              <w:rPr>
+                <w:sz w:val="20"/>
+                <w:szCs w:val="20"/>
+              </w:rPr>
+            </w:pPr>
+            <w:r>
+              <w:rPr>
+                <w:sz w:val="20"/>
+                <w:szCs w:val="20"/>
+              </w:rPr>
+            </w:r>
+          </w:p>
+        </w:tc>
+      </w:tr>
+    </w:tbl>
+    <w:p>
+      <w:pPr>
+        <w:pStyle w:val="Normal"/>
+        <w:bidi w:val="0"/>
+        <w:jc w:val="left"/>
+        <w:rPr/>
+      </w:pPr>
+      <w:r>
+        <w:rPr/>
       </w:r>
     </w:p>
     <w:p>
@@ -4348,6 +5449,38 @@
       </w:pPr>
       <w:r>
         <w:rPr/>
+      </w:r>
+    </w:p>
+    <w:p>
+      <w:pPr>
+        <w:pStyle w:val="Normal"/>
+        <w:bidi w:val="0"/>
+        <w:jc w:val="left"/>
+        <w:rPr/>
+      </w:pPr>
+      <w:r>
+        <w:rPr/>
+      </w:r>
+    </w:p>
+    <w:p>
+      <w:pPr>
+        <w:pStyle w:val="Heading2"/>
+        <w:widowControl/>
+        <w:numPr>
+          <w:ilvl w:val="0"/>
+          <w:numId w:val="0"/>
+        </w:numPr>
+        <w:suppressAutoHyphens w:val="true"/>
+        <w:bidi w:val="0"/>
+        <w:ind w:hanging="0" w:left="0"/>
+        <w:jc w:val="center"/>
+        <w:rPr/>
+      </w:pPr>
+      <w:r>
+        <w:rPr/>
+      </w:r>
+      <w:r>
+        <w:br w:type="page"/>
       </w:r>
     </w:p>
     <w:p>
@@ -4376,23 +5509,7 @@
       </w:pPr>
       <w:r>
         <w:rPr/>
-        <w:t>Para cada una de l</w:t>
-      </w:r>
-      <w:r>
-        <w:rPr/>
-        <w:t>as</w:t>
-      </w:r>
-      <w:r>
-        <w:rPr/>
-        <w:t xml:space="preserve"> </w:t>
-      </w:r>
-      <w:r>
-        <w:rPr/>
-        <w:t xml:space="preserve">imágenes de la cédula, </w:t>
-      </w:r>
-      <w:r>
-        <w:rPr/>
-        <w:t xml:space="preserve"> indicar lo siguiente:</w:t>
+        <w:t>Para cada una de las imágenes de la cédula,  indicar lo siguiente:</w:t>
       </w:r>
     </w:p>
     <w:p>
@@ -4404,11 +5521,7 @@
       </w:pPr>
       <w:r>
         <w:rPr/>
-        <w:t xml:space="preserve">1.- </w:t>
-      </w:r>
-      <w:r>
-        <w:rPr/>
-        <w:t>Nombre del archivo*:</w:t>
+        <w:t>1.- Nombre del archivo*:</w:t>
       </w:r>
     </w:p>
     <w:p>
@@ -4420,11 +5533,7 @@
       </w:pPr>
       <w:r>
         <w:rPr/>
-        <w:t xml:space="preserve">2.- </w:t>
-      </w:r>
-      <w:r>
-        <w:rPr/>
-        <w:t>Título*:</w:t>
+        <w:t>2.- Título*:</w:t>
       </w:r>
     </w:p>
     <w:p>
@@ -4436,11 +5545,7 @@
       </w:pPr>
       <w:r>
         <w:rPr/>
-        <w:t xml:space="preserve">3.- </w:t>
-      </w:r>
-      <w:r>
-        <w:rPr/>
-        <w:t>Nombre y Apellido(s) del autor*:</w:t>
+        <w:t>3.- Nombre y Apellido(s) del autor*:</w:t>
       </w:r>
     </w:p>
     <w:p>
@@ -4452,11 +5557,7 @@
       </w:pPr>
       <w:r>
         <w:rPr/>
-        <w:t xml:space="preserve">4.- </w:t>
-      </w:r>
-      <w:r>
-        <w:rPr/>
-        <w:t>Fecha de creación (opcional):</w:t>
+        <w:t>4.- Fecha de creación (opcional):</w:t>
       </w:r>
     </w:p>
     <w:p>
@@ -4468,11 +5569,7 @@
       </w:pPr>
       <w:r>
         <w:rPr/>
-        <w:t xml:space="preserve">5.- </w:t>
-      </w:r>
-      <w:r>
-        <w:rPr/>
-        <w:t>Texto de pie de figura (opcional):</w:t>
+        <w:t>5.- Texto de pie de figura (opcional):</w:t>
       </w:r>
     </w:p>
     <w:p>
@@ -4484,11 +5581,7 @@
       </w:pPr>
       <w:r>
         <w:rPr/>
-        <w:t xml:space="preserve">6.- </w:t>
-      </w:r>
-      <w:r>
-        <w:rPr/>
-        <w:t>Ubicación (opcional):</w:t>
+        <w:t>6.- Ubicación (opcional):</w:t>
       </w:r>
     </w:p>
     <w:p>
@@ -4500,11 +5593,7 @@
       </w:pPr>
       <w:r>
         <w:rPr/>
-        <w:t xml:space="preserve">7.- </w:t>
-      </w:r>
-      <w:r>
-        <w:rPr/>
-        <w:t>Latitud decimal (Y) de ubicación (opcional):</w:t>
+        <w:t>7.- Latitud decimal (Y) de ubicación (opcional):</w:t>
       </w:r>
     </w:p>
     <w:p>
@@ -4516,11 +5605,7 @@
       </w:pPr>
       <w:r>
         <w:rPr/>
-        <w:t xml:space="preserve">8.- </w:t>
-      </w:r>
-      <w:r>
-        <w:rPr/>
-        <w:t>Longitud decimal (X) de ubicación (opcional):</w:t>
+        <w:t>8.- Longitud decimal (X) de ubicación (opcional):</w:t>
       </w:r>
     </w:p>
     <w:p>
@@ -4533,11 +5618,7 @@
       </w:pPr>
       <w:r>
         <w:rPr/>
-        <w:t xml:space="preserve">9.- </w:t>
-      </w:r>
-      <w:r>
-        <w:rPr/>
-        <w:t>Una o más palabras clave*:</w:t>
+        <w:t>9.- Una o más palabras clave*:</w:t>
       </w:r>
     </w:p>
     <w:sectPr>
@@ -4686,137 +5767,6 @@
   <w:abstractNum w:abstractNumId="2">
     <w:lvl w:ilvl="0">
       <w:start w:val="1"/>
-      <w:numFmt w:val="decimal"/>
-      <w:lvlText w:val="%1."/>
-      <w:lvlJc w:val="left"/>
-      <w:pPr>
-        <w:tabs>
-          <w:tab w:val="num" w:pos="720"/>
-        </w:tabs>
-        <w:ind w:left="720" w:hanging="360"/>
-      </w:pPr>
-      <w:rPr/>
-    </w:lvl>
-    <w:lvl w:ilvl="1">
-      <w:start w:val="1"/>
-      <w:numFmt w:val="decimal"/>
-      <w:lvlText w:val="%1.%2."/>
-      <w:lvlJc w:val="left"/>
-      <w:pPr>
-        <w:tabs>
-          <w:tab w:val="num" w:pos="1080"/>
-        </w:tabs>
-        <w:ind w:left="1080" w:hanging="360"/>
-      </w:pPr>
-      <w:rPr/>
-    </w:lvl>
-    <w:lvl w:ilvl="2">
-      <w:start w:val="1"/>
-      <w:numFmt w:val="lowerLetter"/>
-      <w:lvlText w:val="%3)"/>
-      <w:lvlJc w:val="left"/>
-      <w:pPr>
-        <w:tabs>
-          <w:tab w:val="num" w:pos="1440"/>
-        </w:tabs>
-        <w:ind w:left="1440" w:hanging="360"/>
-      </w:pPr>
-      <w:rPr/>
-    </w:lvl>
-    <w:lvl w:ilvl="3">
-      <w:start w:val="1"/>
-      <w:numFmt w:val="bullet"/>
-      <w:lvlText w:val=""/>
-      <w:lvlJc w:val="left"/>
-      <w:pPr>
-        <w:tabs>
-          <w:tab w:val="num" w:pos="1800"/>
-        </w:tabs>
-        <w:ind w:left="1800" w:hanging="360"/>
-      </w:pPr>
-      <w:rPr>
-        <w:rFonts w:ascii="Symbol" w:hAnsi="Symbol" w:cs="Symbol" w:hint="default"/>
-      </w:rPr>
-    </w:lvl>
-    <w:lvl w:ilvl="4">
-      <w:start w:val="1"/>
-      <w:numFmt w:val="bullet"/>
-      <w:lvlText w:val=""/>
-      <w:lvlJc w:val="left"/>
-      <w:pPr>
-        <w:tabs>
-          <w:tab w:val="num" w:pos="2160"/>
-        </w:tabs>
-        <w:ind w:left="2160" w:hanging="360"/>
-      </w:pPr>
-      <w:rPr>
-        <w:rFonts w:ascii="Symbol" w:hAnsi="Symbol" w:cs="Symbol" w:hint="default"/>
-      </w:rPr>
-    </w:lvl>
-    <w:lvl w:ilvl="5">
-      <w:start w:val="1"/>
-      <w:numFmt w:val="bullet"/>
-      <w:lvlText w:val=""/>
-      <w:lvlJc w:val="left"/>
-      <w:pPr>
-        <w:tabs>
-          <w:tab w:val="num" w:pos="2520"/>
-        </w:tabs>
-        <w:ind w:left="2520" w:hanging="360"/>
-      </w:pPr>
-      <w:rPr>
-        <w:rFonts w:ascii="Symbol" w:hAnsi="Symbol" w:cs="Symbol" w:hint="default"/>
-      </w:rPr>
-    </w:lvl>
-    <w:lvl w:ilvl="6">
-      <w:start w:val="1"/>
-      <w:numFmt w:val="bullet"/>
-      <w:lvlText w:val=""/>
-      <w:lvlJc w:val="left"/>
-      <w:pPr>
-        <w:tabs>
-          <w:tab w:val="num" w:pos="2880"/>
-        </w:tabs>
-        <w:ind w:left="2880" w:hanging="360"/>
-      </w:pPr>
-      <w:rPr>
-        <w:rFonts w:ascii="Symbol" w:hAnsi="Symbol" w:cs="Symbol" w:hint="default"/>
-      </w:rPr>
-    </w:lvl>
-    <w:lvl w:ilvl="7">
-      <w:start w:val="1"/>
-      <w:numFmt w:val="bullet"/>
-      <w:lvlText w:val=""/>
-      <w:lvlJc w:val="left"/>
-      <w:pPr>
-        <w:tabs>
-          <w:tab w:val="num" w:pos="3240"/>
-        </w:tabs>
-        <w:ind w:left="3240" w:hanging="360"/>
-      </w:pPr>
-      <w:rPr>
-        <w:rFonts w:ascii="Symbol" w:hAnsi="Symbol" w:cs="Symbol" w:hint="default"/>
-      </w:rPr>
-    </w:lvl>
-    <w:lvl w:ilvl="8">
-      <w:start w:val="1"/>
-      <w:numFmt w:val="bullet"/>
-      <w:lvlText w:val=""/>
-      <w:lvlJc w:val="left"/>
-      <w:pPr>
-        <w:tabs>
-          <w:tab w:val="num" w:pos="3600"/>
-        </w:tabs>
-        <w:ind w:left="3600" w:hanging="360"/>
-      </w:pPr>
-      <w:rPr>
-        <w:rFonts w:ascii="Symbol" w:hAnsi="Symbol" w:cs="Symbol" w:hint="default"/>
-      </w:rPr>
-    </w:lvl>
-  </w:abstractNum>
-  <w:abstractNum w:abstractNumId="3">
-    <w:lvl w:ilvl="0">
-      <w:start w:val="1"/>
       <w:numFmt w:val="none"/>
       <w:suff w:val="nothing"/>
       <w:lvlText w:val=""/>
@@ -4938,9 +5888,6 @@
   </w:num>
   <w:num w:numId="2">
     <w:abstractNumId w:val="2"/>
-  </w:num>
-  <w:num w:numId="3">
-    <w:abstractNumId w:val="3"/>
   </w:num>
 </w:numbering>
 </file>

</xml_diff>